<commit_message>
rettelser i grnlandspumpeforsøget - kalder det færdigt nu. Slettede den vilde vejledning med 5 delforsøg..
</commit_message>
<xml_diff>
--- a/Øvelser/Geografi/groenlandspumpen-model/groenlandspumpen-model.docx
+++ b/Øvelser/Geografi/groenlandspumpen-model/groenlandspumpen-model.docx
@@ -16,40 +16,6 @@
       </w:pPr>
       <w:r>
         <w:t xml:space="preserve">Modelforsøg med hele cirkulationen i ét kar</w:t>
-      </w:r>
-    </w:p>
-    <w:p>
-      <w:pPr>
-        <w:pStyle w:val="FirstParagraph"/>
-      </w:pPr>
-      <w:r>
-        <w:rPr>
-          <w:b/>
-          <w:bCs/>
-        </w:rPr>
-        <w:t xml:space="preserve">Dato:</w:t>
-      </w:r>
-      <w:r>
-        <w:t xml:space="preserve"> </w:t>
-      </w:r>
-      <w:r>
-        <w:t xml:space="preserve">____________________     </w:t>
-      </w:r>
-      <w:r>
-        <w:t xml:space="preserve"> </w:t>
-      </w:r>
-      <w:r>
-        <w:rPr>
-          <w:b/>
-          <w:bCs/>
-        </w:rPr>
-        <w:t xml:space="preserve">Gruppe / navne:</w:t>
-      </w:r>
-      <w:r>
-        <w:t xml:space="preserve"> </w:t>
-      </w:r>
-      <w:r>
-        <w:t xml:space="preserve">____________________________________________</w:t>
       </w:r>
     </w:p>
     <w:bookmarkStart w:id="19" w:name="om-øvelsen"/>
@@ -522,7 +488,7 @@
             <w:r>
               <w:drawing>
                 <wp:inline>
-                  <wp:extent cx="6096000" cy="2667000"/>
+                  <wp:extent cx="6096000" cy="2247900"/>
                   <wp:effectExtent b="0" l="0" r="0" t="0"/>
                   <wp:docPr descr="" title="" id="37" name="Picture"/>
                   <a:graphic>
@@ -552,7 +518,7 @@
                         <pic:spPr bwMode="auto">
                           <a:xfrm>
                             <a:off x="0" y="0"/>
-                            <a:ext cx="6096000" cy="2667000"/>
+                            <a:ext cx="6096000" cy="2247900"/>
                           </a:xfrm>
                           <a:prstGeom prst="rect">
                             <a:avLst/>
@@ -642,14 +608,6 @@
       </w:hyperlink>
       <w:r>
         <w:t xml:space="preserve">, hvor I tror det blå vand løber hen, når is og varmekilde begge er sat i gang — og hvad der så må ske henne ved den varme ende.</w:t>
-      </w:r>
-    </w:p>
-    <w:p>
-      <w:pPr>
-        <w:pStyle w:val="BodyText"/>
-      </w:pPr>
-      <w:r>
-        <w:t xml:space="preserve">________________________________________________________________________________________________</w:t>
       </w:r>
     </w:p>
     <w:tbl>
@@ -888,7 +846,7 @@
               </w:numPr>
             </w:pPr>
             <w:r>
-              <w:t xml:space="preserve">Gennemsigtigt plexiglas-kar</w:t>
+              <w:t xml:space="preserve">Grønlandspumpen-kar (gennemsigtigt, ca. 30 cm langt)</w:t>
             </w:r>
           </w:p>
           <w:p>
@@ -912,7 +870,7 @@
               </w:numPr>
             </w:pPr>
             <w:r>
-              <w:t xml:space="preserve">Knust is</w:t>
+              <w:t xml:space="preserve">Is</w:t>
             </w:r>
           </w:p>
           <w:p>
@@ -948,42 +906,6 @@
               </w:numPr>
             </w:pPr>
             <w:r>
-              <w:t xml:space="preserve">Lunkent vand</w:t>
-            </w:r>
-          </w:p>
-          <w:p>
-            <w:pPr>
-              <w:pStyle w:val="Compact"/>
-              <w:numPr>
-                <w:ilvl w:val="0"/>
-                <w:numId w:val="1001"/>
-              </w:numPr>
-            </w:pPr>
-            <w:r>
-              <w:t xml:space="preserve">Sort karton til baggrund</w:t>
-            </w:r>
-          </w:p>
-          <w:p>
-            <w:pPr>
-              <w:pStyle w:val="Compact"/>
-              <w:numPr>
-                <w:ilvl w:val="0"/>
-                <w:numId w:val="1001"/>
-              </w:numPr>
-            </w:pPr>
-            <w:r>
-              <w:t xml:space="preserve">Stopur og tommestok/lineal</w:t>
-            </w:r>
-          </w:p>
-          <w:p>
-            <w:pPr>
-              <w:pStyle w:val="Compact"/>
-              <w:numPr>
-                <w:ilvl w:val="0"/>
-                <w:numId w:val="1001"/>
-              </w:numPr>
-            </w:pPr>
-            <w:r>
               <w:t xml:space="preserve">Mobil til billeder</w:t>
             </w:r>
           </w:p>
@@ -991,8 +913,13 @@
         </w:tc>
       </w:tr>
     </w:tbl>
+    <w:p>
+      <w:r>
+        <w:br w:type="page"/>
+      </w:r>
+    </w:p>
     <w:bookmarkEnd w:id="48"/>
-    <w:bookmarkStart w:id="53" w:name="fremgangsmåde"/>
+    <w:bookmarkStart w:id="49" w:name="fremgangsmåde"/>
     <w:p>
       <w:pPr>
         <w:pStyle w:val="Heading2"/>
@@ -1010,7 +937,23 @@
         </w:numPr>
       </w:pPr>
       <w:r>
-        <w:t xml:space="preserve">Fyld karret med lunkent vand, til vandet står lige over isholderpladens nederste kant.</w:t>
+        <w:t xml:space="preserve">Fyld karret med</w:t>
+      </w:r>
+      <w:r>
+        <w:t xml:space="preserve"> </w:t>
+      </w:r>
+      <w:r>
+        <w:rPr>
+          <w:b/>
+          <w:bCs/>
+        </w:rPr>
+        <w:t xml:space="preserve">lunkent</w:t>
+      </w:r>
+      <w:r>
+        <w:t xml:space="preserve"> </w:t>
+      </w:r>
+      <w:r>
+        <w:t xml:space="preserve">vand, til vandet står lige over isholderpladens nederste kant.</w:t>
       </w:r>
     </w:p>
     <w:p>
@@ -1116,55 +1059,20 @@
         </w:numPr>
       </w:pPr>
       <w:r>
-        <w:t xml:space="preserve">Stil sort karton bag karret, og lad være med at røre ved bordet i tre minutter. Start stopuret, når farven begynder at løbe.</w:t>
-      </w:r>
-    </w:p>
-    <w:p>
-      <w:pPr>
-        <w:pStyle w:val="Compact"/>
-        <w:numPr>
-          <w:ilvl w:val="0"/>
-          <w:numId w:val="1002"/>
-        </w:numPr>
-      </w:pPr>
-      <w:r>
         <w:t xml:space="preserve">Observér, hvad der sker med det blå, afkølede vand, både ved bunden og ved overfladen. Notér i</w:t>
       </w:r>
       <w:r>
         <w:t xml:space="preserve"> </w:t>
       </w:r>
-      <w:hyperlink w:anchor="tbl-1">
-        <w:r>
-          <w:rPr>
-            <w:rStyle w:val="Hyperlink"/>
-          </w:rPr>
-          <w:t xml:space="preserve">Tabel 1</w:t>
-        </w:r>
-      </w:hyperlink>
-      <w:r>
-        <w:t xml:space="preserve">.</w:t>
-      </w:r>
-    </w:p>
-    <w:p>
-      <w:pPr>
-        <w:pStyle w:val="Compact"/>
-        <w:numPr>
-          <w:ilvl w:val="0"/>
-          <w:numId w:val="1002"/>
-        </w:numPr>
-      </w:pPr>
       <w:r>
         <w:rPr>
           <w:b/>
           <w:bCs/>
         </w:rPr>
-        <w:t xml:space="preserve">Tag tid:</w:t>
-      </w:r>
-      <w:r>
-        <w:t xml:space="preserve"> </w:t>
-      </w:r>
-      <w:r>
-        <w:t xml:space="preserve">notér, hvor lang tid der går, fra farven begynder at løbe ud under pladen, til fronten når den modsatte ende af karret. Mål samtidig karrets indvendige længde med en lineal.</w:t>
+        <w:t xml:space="preserve">?@tbl-1</w:t>
+      </w:r>
+      <w:r>
+        <w:t xml:space="preserve">.</w:t>
       </w:r>
     </w:p>
     <w:p>
@@ -1196,369 +1104,18 @@
         <w:t xml:space="preserve">— brug en anden farve end gættet.</w:t>
       </w:r>
     </w:p>
-    <w:tbl>
-      <w:tblPr>
-        <w:tblStyle w:val="Table"/>
-        <w:tblW w:type="pct" w:w="5000"/>
-        <w:tblLayout w:type="fixed"/>
-        <w:tblLook w:firstRow="0" w:lastRow="0" w:firstColumn="0" w:lastColumn="0" w:noHBand="0" w:noVBand="0" w:val="0000"/>
-      </w:tblPr>
-      <w:tblGrid>
-        <w:gridCol w:w="7920"/>
-      </w:tblGrid>
-      <w:tr>
-        <w:tc>
-          <w:tcPr/>
-          <w:bookmarkStart w:id="52" w:name="fig-foto"/>
-          <w:p>
-            <w:pPr>
-              <w:pStyle w:val="Compact"/>
-              <w:jc w:val="center"/>
-            </w:pPr>
-            <w:r>
-              <w:drawing>
-                <wp:inline>
-                  <wp:extent cx="5364480" cy="3787997"/>
-                  <wp:effectExtent b="0" l="0" r="0" t="0"/>
-                  <wp:docPr descr="" title="" id="50" name="Picture"/>
-                  <a:graphic>
-                    <a:graphicData uri="http://schemas.openxmlformats.org/drawingml/2006/picture">
-                      <pic:pic>
-                        <pic:nvPicPr>
-                          <pic:cNvPr descr="figurer/opstilling-foto.jpg" id="51" name="Picture"/>
-                          <pic:cNvPicPr>
-                            <a:picLocks noChangeArrowheads="1" noChangeAspect="1"/>
-                          </pic:cNvPicPr>
-                        </pic:nvPicPr>
-                        <pic:blipFill>
-                          <a:blip r:embed="rId49"/>
-                          <a:stretch>
-                            <a:fillRect/>
-                          </a:stretch>
-                        </pic:blipFill>
-                        <pic:spPr bwMode="auto">
-                          <a:xfrm>
-                            <a:off x="0" y="0"/>
-                            <a:ext cx="5364480" cy="3787997"/>
-                          </a:xfrm>
-                          <a:prstGeom prst="rect">
-                            <a:avLst/>
-                          </a:prstGeom>
-                          <a:noFill/>
-                          <a:ln w="9525">
-                            <a:noFill/>
-                            <a:headEnd/>
-                            <a:tailEnd/>
-                          </a:ln>
-                        </pic:spPr>
-                      </pic:pic>
-                    </a:graphicData>
-                  </a:graphic>
-                </wp:inline>
-              </w:drawing>
-            </w:r>
-          </w:p>
-          <w:p>
-            <w:pPr>
-              <w:jc w:val="center"/>
-            </w:pPr>
-            <w:pPr>
-              <w:jc w:val="left"/>
-              <w:spacing w:before="200"/>
-              <w:pStyle w:val="ImageCaption"/>
-            </w:pPr>
-            <w:r>
-              <w:t xml:space="preserve">Figur 5: Sådan ser opstillingen ud i praksis. Her er varmekilden en akvarievarmer; i jeres opstilling er det en flaske med varmt vand.</w:t>
-            </w:r>
-          </w:p>
-          <w:bookmarkEnd w:id="52"/>
-        </w:tc>
-      </w:tr>
-    </w:tbl>
-    <w:p>
-      <w:pPr>
-        <w:pStyle w:val="BodyText"/>
-      </w:pPr>
-      <w:r>
-        <w:t xml:space="preserve">Karrets indvendige længde: ___________ cm</w:t>
-      </w:r>
-    </w:p>
-    <w:bookmarkEnd w:id="53"/>
-    <w:bookmarkStart w:id="55" w:name="registrering-af-målinger"/>
+    <w:bookmarkEnd w:id="49"/>
+    <w:bookmarkStart w:id="50" w:name="journalspørgsmål"/>
     <w:p>
       <w:pPr>
         <w:pStyle w:val="Heading2"/>
       </w:pPr>
       <w:r>
-        <w:t xml:space="preserve">Registrering af målinger</w:t>
-      </w:r>
-    </w:p>
-    <w:tbl>
-      <w:tblPr>
-        <w:tblStyle w:val="Table"/>
-        <w:tblW w:type="pct" w:w="5000"/>
-        <w:tblLayout w:type="fixed"/>
-        <w:tblLook w:firstRow="0" w:lastRow="0" w:firstColumn="0" w:lastColumn="0" w:noHBand="0" w:noVBand="0" w:val="0000"/>
-      </w:tblPr>
-      <w:tblGrid>
-        <w:gridCol w:w="7920"/>
-      </w:tblGrid>
-      <w:tr>
-        <w:tc>
-          <w:tcPr/>
-          <w:bookmarkStart w:id="54" w:name="tbl-1"/>
-          <w:p>
-            <w:pPr>
-              <w:jc w:val="center"/>
-            </w:pPr>
-            <w:pPr>
-              <w:jc w:val="left"/>
-              <w:spacing w:before="200"/>
-              <w:pStyle w:val="ImageCaption"/>
-            </w:pPr>
-            <w:r>
-              <w:t xml:space="preserve">Tabel 1: Iagttagelser fra forsøget. Tiden er den tid, bundstrømmen er om at nå den modsatte ende.</w:t>
-            </w:r>
-          </w:p>
-          <w:tbl>
-            <w:tblPr>
-              <w:tblStyle w:val="Table"/>
-              <w:tblW w:type="auto" w:w="0"/>
-              <w:tblLook w:firstRow="1" w:lastRow="0" w:firstColumn="0" w:lastColumn="0" w:noHBand="0" w:noVBand="0" w:val="0020"/>
-            </w:tblPr>
-            <w:tblGrid>
-              <w:gridCol w:w="2640"/>
-              <w:gridCol w:w="2640"/>
-              <w:gridCol w:w="2640"/>
-            </w:tblGrid>
-            <w:tr>
-              <w:trPr>
-                <w:cantSplit/>
-                <w:tblHeader w:val="on"/>
-              </w:trPr>
-              <w:tc>
-                <w:tcPr/>
-                <w:p>
-                  <w:pPr>
-                    <w:pStyle w:val="Compact"/>
-                    <w:keepNext/>
-                    <w:jc w:val="left"/>
-                    <w:jc w:val="center"/>
-                  </w:pPr>
-                  <w:r>
-                    <w:t xml:space="preserve">Det forventede vi</w:t>
-                  </w:r>
-                </w:p>
-              </w:tc>
-              <w:tc>
-                <w:tcPr/>
-                <w:p>
-                  <w:pPr>
-                    <w:pStyle w:val="Compact"/>
-                    <w:keepNext/>
-                    <w:jc w:val="left"/>
-                    <w:jc w:val="center"/>
-                  </w:pPr>
-                  <w:r>
-                    <w:t xml:space="preserve">Det så vi</w:t>
-                  </w:r>
-                </w:p>
-              </w:tc>
-              <w:tc>
-                <w:tcPr/>
-                <w:p>
-                  <w:pPr>
-                    <w:pStyle w:val="Compact"/>
-                    <w:keepNext/>
-                    <w:jc w:val="center"/>
-                    <w:jc w:val="center"/>
-                  </w:pPr>
-                  <w:r>
-                    <w:t xml:space="preserve">Tid (s)</w:t>
-                  </w:r>
-                </w:p>
-              </w:tc>
-            </w:tr>
-            <w:tr>
-              <w:trPr>
-                <w:cantSplit/>
-              </w:trPr>
-              <w:tc>
-                <w:tcPr/>
-                <w:p>
-                  <w:pPr>
-                    <w:pStyle w:val="Compact"/>
-                  </w:pPr>
-                </w:p>
-              </w:tc>
-              <w:tc>
-                <w:tcPr/>
-                <w:p>
-                  <w:pPr>
-                    <w:pStyle w:val="Compact"/>
-                  </w:pPr>
-                </w:p>
-              </w:tc>
-              <w:tc>
-                <w:tcPr/>
-                <w:p>
-                  <w:pPr>
-                    <w:pStyle w:val="Compact"/>
-                  </w:pPr>
-                </w:p>
-              </w:tc>
-            </w:tr>
-          </w:tbl>
-          <w:bookmarkEnd w:id="54"/>
-          <w:p/>
-        </w:tc>
-      </w:tr>
-    </w:tbl>
-    <w:bookmarkEnd w:id="55"/>
-    <w:bookmarkStart w:id="56" w:name="databehandling"/>
-    <w:p>
-      <w:pPr>
-        <w:pStyle w:val="Heading2"/>
-      </w:pPr>
-      <w:r>
-        <w:t xml:space="preserve">Databehandling</w:t>
-      </w:r>
-    </w:p>
-    <w:p>
-      <w:pPr>
-        <w:pStyle w:val="FirstParagraph"/>
-      </w:pPr>
-      <w:r>
-        <w:rPr>
-          <w:b/>
-          <w:bCs/>
-        </w:rPr>
-        <w:t xml:space="preserve">1. Bundstrømmens fart.</w:t>
-      </w:r>
-      <w:r>
-        <w:t xml:space="preserve"> </w:t>
-      </w:r>
-      <w:r>
-        <w:t xml:space="preserve">Beregn farten af det blå vand langs bunden:</w:t>
-      </w:r>
-    </w:p>
-    <w:p>
-      <w:pPr>
-        <w:pStyle w:val="BodyText"/>
-      </w:pPr>
-      <m:oMathPara>
-        <m:oMathParaPr>
-          <m:jc m:val="center"/>
-        </m:oMathParaPr>
-        <m:oMath>
-          <m:r>
-            <m:t>v</m:t>
-          </m:r>
-          <m:r>
-            <m:rPr>
-              <m:sty m:val="p"/>
-            </m:rPr>
-            <m:t>=</m:t>
-          </m:r>
-          <m:f>
-            <m:fPr>
-              <m:type m:val="bar"/>
-            </m:fPr>
-            <m:num>
-              <m:r>
-                <m:t>s</m:t>
-              </m:r>
-            </m:num>
-            <m:den>
-              <m:r>
-                <m:t>t</m:t>
-              </m:r>
-            </m:den>
-          </m:f>
-        </m:oMath>
-      </m:oMathPara>
-    </w:p>
-    <w:p>
-      <w:pPr>
-        <w:pStyle w:val="FirstParagraph"/>
-      </w:pPr>
-      <w:r>
-        <w:t xml:space="preserve">hvor</w:t>
-      </w:r>
-      <w:r>
-        <w:t xml:space="preserve"> </w:t>
-      </w:r>
-      <m:oMath>
-        <m:r>
-          <m:t>s</m:t>
-        </m:r>
-      </m:oMath>
-      <w:r>
-        <w:t xml:space="preserve"> </w:t>
-      </w:r>
-      <w:r>
-        <w:t xml:space="preserve">er karrets indvendige længde, og</w:t>
-      </w:r>
-      <w:r>
-        <w:t xml:space="preserve"> </w:t>
-      </w:r>
-      <m:oMath>
-        <m:r>
-          <m:t>t</m:t>
-        </m:r>
-      </m:oMath>
-      <w:r>
-        <w:t xml:space="preserve"> </w:t>
-      </w:r>
-      <w:r>
-        <w:t xml:space="preserve">er den tid, I målte i</w:t>
-      </w:r>
-      <w:r>
-        <w:t xml:space="preserve"> </w:t>
-      </w:r>
-      <w:hyperlink w:anchor="tbl-1">
-        <w:r>
-          <w:rPr>
-            <w:rStyle w:val="Hyperlink"/>
-          </w:rPr>
-          <w:t xml:space="preserve">Tabel 1</w:t>
-        </w:r>
-      </w:hyperlink>
-      <w:r>
-        <w:t xml:space="preserve">. Angiv resultatet i cm/s.</w:t>
-      </w:r>
-    </w:p>
-    <w:p>
-      <w:pPr>
-        <w:pStyle w:val="BodyText"/>
-      </w:pPr>
-      <w:r>
-        <w:rPr>
-          <w:b/>
-          <w:bCs/>
-        </w:rPr>
-        <w:t xml:space="preserve">2. Sammenlign med det virkelige hav.</w:t>
-      </w:r>
-      <w:r>
-        <w:t xml:space="preserve"> </w:t>
-      </w:r>
-      <w:r>
-        <w:t xml:space="preserve">Det nordatlantiske dybvand løber sydpå med omkring 2–10 cm/s — men over en strækning, der er mange millioner gange længere end jeres kar. Sammenlign med jeres egen måling, og vurdér, om det giver mening at sammenligne farten direkte.</w:t>
-      </w:r>
-    </w:p>
-    <w:bookmarkEnd w:id="56"/>
-    <w:bookmarkStart w:id="57" w:name="journalspørgsmål"/>
-    <w:p>
-      <w:pPr>
-        <w:pStyle w:val="Heading2"/>
-      </w:pPr>
-      <w:r>
         <w:t xml:space="preserve">Journalspørgsmål</w:t>
       </w:r>
     </w:p>
     <w:p>
       <w:pPr>
-        <w:pStyle w:val="Compact"/>
         <w:numPr>
           <w:ilvl w:val="0"/>
           <w:numId w:val="1003"/>
@@ -1570,65 +1127,38 @@
     </w:p>
     <w:p>
       <w:pPr>
-        <w:pStyle w:val="Compact"/>
         <w:numPr>
           <w:ilvl w:val="0"/>
           <w:numId w:val="1003"/>
         </w:numPr>
       </w:pPr>
       <w:r>
-        <w:t xml:space="preserve">Hvorfor er det nødvendigt, at isholderpladens udskæring vender nedad? Hvad tror I ville ske, hvis pladen vendte omvendt?</w:t>
-      </w:r>
-    </w:p>
-    <w:p>
-      <w:pPr>
-        <w:pStyle w:val="Compact"/>
+        <w:t xml:space="preserve">Nævn mindst to måder, modellen er en forsimpling af den virkelige Grønlandspumpe på (tænk på saltholdighed, vind og Jordens rotation).</w:t>
+      </w:r>
+    </w:p>
+    <w:p>
+      <w:pPr>
         <w:numPr>
           <w:ilvl w:val="0"/>
           <w:numId w:val="1003"/>
         </w:numPr>
       </w:pPr>
       <w:r>
-        <w:t xml:space="preserve">Nævn mindst to måder, modellen er en forsimpling af den virkelige Grønlandspumpe på (tænk på saltholdighed, vind og Jordens rotation).</w:t>
-      </w:r>
-    </w:p>
-    <w:p>
-      <w:pPr>
-        <w:pStyle w:val="Compact"/>
+        <w:t xml:space="preserve">Hvad tror I ville ske, hvis I brugte koldt saltvand i stedet for bare is og koldt ferskvand ved den kolde ende? Ville cirkulationen blive kraftigere eller svagere — og hvorfor?</w:t>
+      </w:r>
+    </w:p>
+    <w:p>
+      <w:pPr>
         <w:numPr>
           <w:ilvl w:val="0"/>
           <w:numId w:val="1003"/>
         </w:numPr>
       </w:pPr>
       <w:r>
-        <w:t xml:space="preserve">Hvad tror I ville ske, hvis I brugte koldt saltvand i stedet for bare is og koldt ferskvand ved den kolde ende? Ville cirkulationen blive kraftigere eller svagere — og hvorfor?</w:t>
-      </w:r>
-    </w:p>
-    <w:p>
-      <w:pPr>
-        <w:pStyle w:val="Compact"/>
-        <w:numPr>
-          <w:ilvl w:val="0"/>
-          <w:numId w:val="1003"/>
-        </w:numPr>
-      </w:pPr>
-      <w:r>
-        <w:t xml:space="preserve">Hvad kan der ske med denne cirkulation, hvis der tilføres store mængder smeltevand fra Grønlands indlandsis? Begrund svaret med, at smeltevand er fersk og derfor let.</w:t>
-      </w:r>
-    </w:p>
-    <w:p>
-      <w:pPr>
-        <w:pStyle w:val="Compact"/>
-        <w:numPr>
-          <w:ilvl w:val="0"/>
-          <w:numId w:val="1003"/>
-        </w:numPr>
-      </w:pPr>
-      <w:r>
-        <w:t xml:space="preserve">Diskutér metoden: hvad kunne have gjort det svært at bestemme, præcis hvornår farvefronten nåede den modsatte ende?</w:t>
-      </w:r>
-    </w:p>
-    <w:bookmarkEnd w:id="57"/>
+        <w:t xml:space="preserve">Hvad kan der ske med denne cirkulation, hvis der tilføres store mængder smeltevand fra Grønlands indlandsis? Begrund svaret.</w:t>
+      </w:r>
+    </w:p>
+    <w:bookmarkEnd w:id="50"/>
     <w:sectPr>
       <w:headerReference r:id="rId7" w:type="default"/>
       <w:footerReference r:id="rId8" w:type="default"/>

</xml_diff>

<commit_message>
Journalspørgsmål i porøsitet-vejledningerne, oversigten i mål
Begge porøsitet-vejledninger får afsnittene Databehandling og
Journalspørgsmål (HF også nedsivningshastighed og spørgsmål fra
eksamensoplægget). Grønlandspumpen-model: død henvisning til en
fjernet tabel rettet. Oversigten: rigtige data-felter for de
kvalitative øvelser, tæller for kvalitative og opdateret «Det der
mangler», nu hvor alle vejledninger har begge afsnit og fag-felt.

Co-Authored-By: Claude Opus 5.5 <noreply@anthropic.com>
</commit_message>
<xml_diff>
--- a/Øvelser/Geografi/groenlandspumpen-model/groenlandspumpen-model.docx
+++ b/Øvelser/Geografi/groenlandspumpen-model/groenlandspumpen-model.docx
@@ -583,7 +583,7 @@
                     <a:graphicData uri="http://schemas.openxmlformats.org/drawingml/2006/picture">
                       <pic:pic>
                         <pic:nvPicPr>
-                          <pic:cNvPr descr="/tmp/claude-0/-home-user-smbi/7d291b92-c289-57a9-b4b8-12c4134f11be/scratchpad/qo/quarto-1.10.18/share/formats/docx/important.png" id="44" name="Picture"/>
+                          <pic:cNvPr descr="/Applications/quarto/share/formats/docx/important.png" id="44" name="Picture"/>
                           <pic:cNvPicPr>
                             <a:picLocks noChangeArrowheads="1" noChangeAspect="1"/>
                           </pic:cNvPicPr>
@@ -708,7 +708,7 @@
                     <a:graphicData uri="http://schemas.openxmlformats.org/drawingml/2006/picture">
                       <pic:pic>
                         <pic:nvPicPr>
-                          <pic:cNvPr descr="/tmp/claude-0/-home-user-smbi/7d291b92-c289-57a9-b4b8-12c4134f11be/scratchpad/qo/quarto-1.10.18/share/formats/docx/note.png" id="47" name="Picture"/>
+                          <pic:cNvPr descr="/Applications/quarto/share/formats/docx/note.png" id="47" name="Picture"/>
                           <pic:cNvPicPr>
                             <a:picLocks noChangeArrowheads="1" noChangeAspect="1"/>
                           </pic:cNvPicPr>
@@ -937,20 +937,7 @@
         </w:numPr>
       </w:pPr>
       <w:r>
-        <w:t xml:space="preserve">Observér, hvad der sker med det blå, afkølede vand, både ved bunden og ved overfladen. Notér i</w:t>
-      </w:r>
-      <w:r>
-        <w:t xml:space="preserve"> </w:t>
-      </w:r>
-      <w:r>
-        <w:rPr>
-          <w:b/>
-          <w:bCs/>
-        </w:rPr>
-        <w:t xml:space="preserve">?@tbl-1</w:t>
-      </w:r>
-      <w:r>
-        <w:t xml:space="preserve">.</w:t>
+        <w:t xml:space="preserve">Observér, hvad der sker med det blå, afkølede vand, både ved bunden og ved overfladen, og notér jeres iagttagelser.</w:t>
       </w:r>
     </w:p>
     <w:p>

</xml_diff>